<commit_message>
docs: enlace al repositorio de GitHub en el informe final
</commit_message>
<xml_diff>
--- a/entregable/informe_hito3.docx
+++ b/entregable/informe_hito3.docx
@@ -41,6 +41,14 @@
       </w:pPr>
       <w:r>
         <w:t>Aplicacion bajo prueba: https://www.saucedemo.com/</w:t>
+      </w:r>
+    </w:p>
+    <w:p>
+      <w:pPr>
+        <w:jc w:val="center"/>
+      </w:pPr>
+      <w:r>
+        <w:t>Repositorio del proyecto: https://github.com/mew145/Examen-Hito-3-TQA</w:t>
       </w:r>
     </w:p>
     <w:p>
@@ -98,7 +106,7 @@
     </w:p>
     <w:p>
       <w:r>
-        <w:t>El presente informe documenta el proceso de prueba aplicado sobre https://www.saucedemo.com/ (SauceDemo / Swag Labs), sitio de demostracion utilizado para practicar tecnicas de pruebas funcionales. Se disenaron y ejecutaron 5 casos de prueba de caja negra, se analizo un fragmento de codigo en Python con tecnicas de caja blanca, se redactaron escenarios Gherkin y se documentaron los defectos reproducibles encontrados, todo ello organizado en un repositorio individual de GitHub con Issues y Project Board.</w:t>
+        <w:t>El presente informe documenta el proceso de prueba aplicado sobre https://www.saucedemo.com/ (SauceDemo / Swag Labs), sitio de demostracion utilizado para practicar tecnicas de pruebas funcionales. Se disenaron y ejecutaron 5 casos de prueba de caja negra, se analizo un fragmento de codigo en Python con tecnicas de caja blanca, se redactaron escenarios Gherkin y se documentaron los defectos reproducibles encontrados, todo ello organizado en un repositorio individual de GitHub (https://github.com/mew145/Examen-Hito-3-TQA) con commits descriptivos e Issues de seguimiento.</w:t>
       </w:r>
     </w:p>
     <w:p>
@@ -6201,7 +6209,729 @@
         <w:pStyle w:val="Heading1"/>
       </w:pPr>
       <w:r>
-        <w:t>6. Conclusiones</w:t>
+        <w:t>6. Organizacion del trabajo en GitHub</w:t>
+      </w:r>
+    </w:p>
+    <w:p>
+      <w:r>
+        <w:t>Todo el trabajo quedo versionado y documentado en un repositorio individual:</w:t>
+      </w:r>
+    </w:p>
+    <w:tbl>
+      <w:tblPr>
+        <w:tblStyle w:val="TableGrid"/>
+        <w:tblW w:type="auto" w:w="0"/>
+        <w:tblLook w:firstColumn="1" w:firstRow="1" w:lastColumn="0" w:lastRow="0" w:noHBand="0" w:noVBand="1" w:val="04A0"/>
+      </w:tblPr>
+      <w:tblGrid>
+        <w:gridCol w:w="4320"/>
+        <w:gridCol w:w="4320"/>
+      </w:tblGrid>
+      <w:tr>
+        <w:tc>
+          <w:tcPr>
+            <w:tcW w:type="dxa" w:w="4320"/>
+          </w:tcPr>
+          <w:p>
+            <w:r>
+              <w:rPr>
+                <w:b/>
+              </w:rPr>
+              <w:t>Repositorio</w:t>
+            </w:r>
+          </w:p>
+        </w:tc>
+        <w:tc>
+          <w:tcPr>
+            <w:tcW w:type="dxa" w:w="4320"/>
+          </w:tcPr>
+          <w:p>
+            <w:r>
+              <w:t>https://github.com/mew145/Examen-Hito-3-TQA</w:t>
+            </w:r>
+          </w:p>
+        </w:tc>
+      </w:tr>
+      <w:tr>
+        <w:tc>
+          <w:tcPr>
+            <w:tcW w:type="dxa" w:w="4320"/>
+          </w:tcPr>
+          <w:p>
+            <w:r>
+              <w:rPr>
+                <w:b/>
+              </w:rPr>
+              <w:t>Rama principal</w:t>
+            </w:r>
+          </w:p>
+        </w:tc>
+        <w:tc>
+          <w:tcPr>
+            <w:tcW w:type="dxa" w:w="4320"/>
+          </w:tcPr>
+          <w:p>
+            <w:r>
+              <w:t>main</w:t>
+            </w:r>
+          </w:p>
+        </w:tc>
+      </w:tr>
+      <w:tr>
+        <w:tc>
+          <w:tcPr>
+            <w:tcW w:type="dxa" w:w="4320"/>
+          </w:tcPr>
+          <w:p>
+            <w:r>
+              <w:rPr>
+                <w:b/>
+              </w:rPr>
+              <w:t>Estudiante (propietario)</w:t>
+            </w:r>
+          </w:p>
+        </w:tc>
+        <w:tc>
+          <w:tcPr>
+            <w:tcW w:type="dxa" w:w="4320"/>
+          </w:tcPr>
+          <w:p>
+            <w:r>
+              <w:t>mew145 - Yuri Rojas</w:t>
+            </w:r>
+          </w:p>
+        </w:tc>
+      </w:tr>
+      <w:tr>
+        <w:tc>
+          <w:tcPr>
+            <w:tcW w:type="dxa" w:w="4320"/>
+          </w:tcPr>
+          <w:p>
+            <w:r>
+              <w:rPr>
+                <w:b/>
+              </w:rPr>
+              <w:t>Colaborador (docente)</w:t>
+            </w:r>
+          </w:p>
+        </w:tc>
+        <w:tc>
+          <w:tcPr>
+            <w:tcW w:type="dxa" w:w="4320"/>
+          </w:tcPr>
+          <w:p>
+            <w:r>
+              <w:t>@Reynel7 (Reynel Sanchez), permisos de escritura (invitacion aceptada)</w:t>
+            </w:r>
+          </w:p>
+        </w:tc>
+      </w:tr>
+      <w:tr>
+        <w:tc>
+          <w:tcPr>
+            <w:tcW w:type="dxa" w:w="4320"/>
+          </w:tcPr>
+          <w:p>
+            <w:r>
+              <w:rPr>
+                <w:b/>
+              </w:rPr>
+              <w:t>Nota sobre el correo</w:t>
+            </w:r>
+          </w:p>
+        </w:tc>
+        <w:tc>
+          <w:tcPr>
+            <w:tcW w:type="dxa" w:w="4320"/>
+          </w:tcPr>
+          <w:p>
+            <w:r>
+              <w:t>La invitacion al correo doc.reynel.sanchez.ch@unifranz.edu.bo no es posible mediante la API porque GitHub exige que el correo este verificado y asociado a una cuenta; por eso se invito al usuario del docente.</w:t>
+            </w:r>
+          </w:p>
+        </w:tc>
+      </w:tr>
+    </w:tbl>
+    <w:p>
+      <w:r>
+        <w:rPr>
+          <w:b/>
+        </w:rPr>
+        <w:t>Estructura del repositorio:</w:t>
+      </w:r>
+    </w:p>
+    <w:p>
+      <w:r>
+        <w:rPr>
+          <w:rFonts w:ascii="Consolas" w:hAnsi="Consolas"/>
+          <w:sz w:val="18"/>
+        </w:rPr>
+        <w:t>Examen-Hito-3-TQA/</w:t>
+        <w:br/>
+        <w:t>├── README.md</w:t>
+        <w:br/>
+        <w:t>├── docs/            casos_caja_negra.md, plantilla completada (.docx), analisis_caja_blanca.md,</w:t>
+        <w:br/>
+        <w:t>│                    casos_caja_blanca_resultados.md, escenarios_gherkin.md</w:t>
+        <w:br/>
+        <w:t>├── bugs/            bugs_encontrados.md (BUG-001)</w:t>
+        <w:br/>
+        <w:t>├── evidencias/      capturas/ (12 capturas de pantalla)</w:t>
+        <w:br/>
+        <w:t>├── entregable/      informe_hito3.pdf, casos_prueba_caja_negra.pdf</w:t>
+        <w:br/>
+        <w:t>└── scripts/         ejecucion de pruebas (Playwright), caja blanca e informes</w:t>
+      </w:r>
+    </w:p>
+    <w:p>
+      <w:r>
+        <w:rPr>
+          <w:b/>
+        </w:rPr>
+        <w:t>Issues de seguimiento (creados desde la terminal con gh):</w:t>
+      </w:r>
+    </w:p>
+    <w:tbl>
+      <w:tblPr>
+        <w:tblStyle w:val="TableGrid"/>
+        <w:tblW w:type="auto" w:w="0"/>
+        <w:tblLook w:firstColumn="1" w:firstRow="1" w:lastColumn="0" w:lastRow="0" w:noHBand="0" w:noVBand="1" w:val="04A0"/>
+      </w:tblPr>
+      <w:tblGrid>
+        <w:gridCol w:w="2160"/>
+        <w:gridCol w:w="2160"/>
+        <w:gridCol w:w="2160"/>
+        <w:gridCol w:w="2160"/>
+      </w:tblGrid>
+      <w:tr>
+        <w:tc>
+          <w:tcPr>
+            <w:tcW w:type="dxa" w:w="2160"/>
+          </w:tcPr>
+          <w:p>
+            <w:r>
+              <w:rPr>
+                <w:b/>
+              </w:rPr>
+              <w:t>Issue</w:t>
+            </w:r>
+          </w:p>
+        </w:tc>
+        <w:tc>
+          <w:tcPr>
+            <w:tcW w:type="dxa" w:w="2160"/>
+          </w:tcPr>
+          <w:p>
+            <w:r>
+              <w:rPr>
+                <w:b/>
+              </w:rPr>
+              <w:t>Titulo</w:t>
+            </w:r>
+          </w:p>
+        </w:tc>
+        <w:tc>
+          <w:tcPr>
+            <w:tcW w:type="dxa" w:w="2160"/>
+          </w:tcPr>
+          <w:p>
+            <w:r>
+              <w:rPr>
+                <w:b/>
+              </w:rPr>
+              <w:t>Label</w:t>
+            </w:r>
+          </w:p>
+        </w:tc>
+        <w:tc>
+          <w:tcPr>
+            <w:tcW w:type="dxa" w:w="2160"/>
+          </w:tcPr>
+          <w:p>
+            <w:r>
+              <w:rPr>
+                <w:b/>
+              </w:rPr>
+              <w:t>Estado</w:t>
+            </w:r>
+          </w:p>
+        </w:tc>
+      </w:tr>
+      <w:tr>
+        <w:tc>
+          <w:tcPr>
+            <w:tcW w:type="dxa" w:w="2160"/>
+          </w:tcPr>
+          <w:p>
+            <w:r>
+              <w:t>#1 / #12</w:t>
+            </w:r>
+          </w:p>
+        </w:tc>
+        <w:tc>
+          <w:tcPr>
+            <w:tcW w:type="dxa" w:w="2160"/>
+          </w:tcPr>
+          <w:p>
+            <w:r>
+              <w:t>BUG-001: el checkout acepta campos con solo espacios en blanco</w:t>
+            </w:r>
+          </w:p>
+        </w:tc>
+        <w:tc>
+          <w:tcPr>
+            <w:tcW w:type="dxa" w:w="2160"/>
+          </w:tcPr>
+          <w:p>
+            <w:r>
+              <w:t>bug</w:t>
+            </w:r>
+          </w:p>
+        </w:tc>
+        <w:tc>
+          <w:tcPr>
+            <w:tcW w:type="dxa" w:w="2160"/>
+          </w:tcPr>
+          <w:p>
+            <w:r>
+              <w:t>Cerrado (documentado)</w:t>
+            </w:r>
+          </w:p>
+        </w:tc>
+      </w:tr>
+      <w:tr>
+        <w:tc>
+          <w:tcPr>
+            <w:tcW w:type="dxa" w:w="2160"/>
+          </w:tcPr>
+          <w:p>
+            <w:r>
+              <w:t>#2</w:t>
+            </w:r>
+          </w:p>
+        </w:tc>
+        <w:tc>
+          <w:tcPr>
+            <w:tcW w:type="dxa" w:w="2160"/>
+          </w:tcPr>
+          <w:p>
+            <w:r>
+              <w:t>Disenar 5 casos de prueba de caja negra</w:t>
+            </w:r>
+          </w:p>
+        </w:tc>
+        <w:tc>
+          <w:tcPr>
+            <w:tcW w:type="dxa" w:w="2160"/>
+          </w:tcPr>
+          <w:p>
+            <w:r>
+              <w:t>tarea</w:t>
+            </w:r>
+          </w:p>
+        </w:tc>
+        <w:tc>
+          <w:tcPr>
+            <w:tcW w:type="dxa" w:w="2160"/>
+          </w:tcPr>
+          <w:p>
+            <w:r>
+              <w:t>Cerrado</w:t>
+            </w:r>
+          </w:p>
+        </w:tc>
+      </w:tr>
+      <w:tr>
+        <w:tc>
+          <w:tcPr>
+            <w:tcW w:type="dxa" w:w="2160"/>
+          </w:tcPr>
+          <w:p>
+            <w:r>
+              <w:t>#3</w:t>
+            </w:r>
+          </w:p>
+        </w:tc>
+        <w:tc>
+          <w:tcPr>
+            <w:tcW w:type="dxa" w:w="2160"/>
+          </w:tcPr>
+          <w:p>
+            <w:r>
+              <w:t>Ejecutar los casos de caja negra en SauceDemo</w:t>
+            </w:r>
+          </w:p>
+        </w:tc>
+        <w:tc>
+          <w:tcPr>
+            <w:tcW w:type="dxa" w:w="2160"/>
+          </w:tcPr>
+          <w:p>
+            <w:r>
+              <w:t>tarea</w:t>
+            </w:r>
+          </w:p>
+        </w:tc>
+        <w:tc>
+          <w:tcPr>
+            <w:tcW w:type="dxa" w:w="2160"/>
+          </w:tcPr>
+          <w:p>
+            <w:r>
+              <w:t>Cerrado</w:t>
+            </w:r>
+          </w:p>
+        </w:tc>
+      </w:tr>
+      <w:tr>
+        <w:tc>
+          <w:tcPr>
+            <w:tcW w:type="dxa" w:w="2160"/>
+          </w:tcPr>
+          <w:p>
+            <w:r>
+              <w:t>#4</w:t>
+            </w:r>
+          </w:p>
+        </w:tc>
+        <w:tc>
+          <w:tcPr>
+            <w:tcW w:type="dxa" w:w="2160"/>
+          </w:tcPr>
+          <w:p>
+            <w:r>
+              <w:t>Registrar capturas de evidencia</w:t>
+            </w:r>
+          </w:p>
+        </w:tc>
+        <w:tc>
+          <w:tcPr>
+            <w:tcW w:type="dxa" w:w="2160"/>
+          </w:tcPr>
+          <w:p>
+            <w:r>
+              <w:t>tarea</w:t>
+            </w:r>
+          </w:p>
+        </w:tc>
+        <w:tc>
+          <w:tcPr>
+            <w:tcW w:type="dxa" w:w="2160"/>
+          </w:tcPr>
+          <w:p>
+            <w:r>
+              <w:t>Cerrado</w:t>
+            </w:r>
+          </w:p>
+        </w:tc>
+      </w:tr>
+      <w:tr>
+        <w:tc>
+          <w:tcPr>
+            <w:tcW w:type="dxa" w:w="2160"/>
+          </w:tcPr>
+          <w:p>
+            <w:r>
+              <w:t>#5</w:t>
+            </w:r>
+          </w:p>
+        </w:tc>
+        <w:tc>
+          <w:tcPr>
+            <w:tcW w:type="dxa" w:w="2160"/>
+          </w:tcPr>
+          <w:p>
+            <w:r>
+              <w:t>Analizar el codigo de caja blanca y determinar la cobertura</w:t>
+            </w:r>
+          </w:p>
+        </w:tc>
+        <w:tc>
+          <w:tcPr>
+            <w:tcW w:type="dxa" w:w="2160"/>
+          </w:tcPr>
+          <w:p>
+            <w:r>
+              <w:t>tarea</w:t>
+            </w:r>
+          </w:p>
+        </w:tc>
+        <w:tc>
+          <w:tcPr>
+            <w:tcW w:type="dxa" w:w="2160"/>
+          </w:tcPr>
+          <w:p>
+            <w:r>
+              <w:t>Cerrado</w:t>
+            </w:r>
+          </w:p>
+        </w:tc>
+      </w:tr>
+      <w:tr>
+        <w:tc>
+          <w:tcPr>
+            <w:tcW w:type="dxa" w:w="2160"/>
+          </w:tcPr>
+          <w:p>
+            <w:r>
+              <w:t>#6</w:t>
+            </w:r>
+          </w:p>
+        </w:tc>
+        <w:tc>
+          <w:tcPr>
+            <w:tcW w:type="dxa" w:w="2160"/>
+          </w:tcPr>
+          <w:p>
+            <w:r>
+              <w:t>Ejecutar los casos de caja blanca (CB-001 a CB-004)</w:t>
+            </w:r>
+          </w:p>
+        </w:tc>
+        <w:tc>
+          <w:tcPr>
+            <w:tcW w:type="dxa" w:w="2160"/>
+          </w:tcPr>
+          <w:p>
+            <w:r>
+              <w:t>tarea</w:t>
+            </w:r>
+          </w:p>
+        </w:tc>
+        <w:tc>
+          <w:tcPr>
+            <w:tcW w:type="dxa" w:w="2160"/>
+          </w:tcPr>
+          <w:p>
+            <w:r>
+              <w:t>Cerrado</w:t>
+            </w:r>
+          </w:p>
+        </w:tc>
+      </w:tr>
+      <w:tr>
+        <w:tc>
+          <w:tcPr>
+            <w:tcW w:type="dxa" w:w="2160"/>
+          </w:tcPr>
+          <w:p>
+            <w:r>
+              <w:t>#7</w:t>
+            </w:r>
+          </w:p>
+        </w:tc>
+        <w:tc>
+          <w:tcPr>
+            <w:tcW w:type="dxa" w:w="2160"/>
+          </w:tcPr>
+          <w:p>
+            <w:r>
+              <w:t>Redactar escenarios Gherkin (actividad adicional)</w:t>
+            </w:r>
+          </w:p>
+        </w:tc>
+        <w:tc>
+          <w:tcPr>
+            <w:tcW w:type="dxa" w:w="2160"/>
+          </w:tcPr>
+          <w:p>
+            <w:r>
+              <w:t>tarea</w:t>
+            </w:r>
+          </w:p>
+        </w:tc>
+        <w:tc>
+          <w:tcPr>
+            <w:tcW w:type="dxa" w:w="2160"/>
+          </w:tcPr>
+          <w:p>
+            <w:r>
+              <w:t>Cerrado</w:t>
+            </w:r>
+          </w:p>
+        </w:tc>
+      </w:tr>
+      <w:tr>
+        <w:tc>
+          <w:tcPr>
+            <w:tcW w:type="dxa" w:w="2160"/>
+          </w:tcPr>
+          <w:p>
+            <w:r>
+              <w:t>#8</w:t>
+            </w:r>
+          </w:p>
+        </w:tc>
+        <w:tc>
+          <w:tcPr>
+            <w:tcW w:type="dxa" w:w="2160"/>
+          </w:tcPr>
+          <w:p>
+            <w:r>
+              <w:t>Documentar defectos reproducibles</w:t>
+            </w:r>
+          </w:p>
+        </w:tc>
+        <w:tc>
+          <w:tcPr>
+            <w:tcW w:type="dxa" w:w="2160"/>
+          </w:tcPr>
+          <w:p>
+            <w:r>
+              <w:t>tarea</w:t>
+            </w:r>
+          </w:p>
+        </w:tc>
+        <w:tc>
+          <w:tcPr>
+            <w:tcW w:type="dxa" w:w="2160"/>
+          </w:tcPr>
+          <w:p>
+            <w:r>
+              <w:t>Cerrado</w:t>
+            </w:r>
+          </w:p>
+        </w:tc>
+      </w:tr>
+      <w:tr>
+        <w:tc>
+          <w:tcPr>
+            <w:tcW w:type="dxa" w:w="2160"/>
+          </w:tcPr>
+          <w:p>
+            <w:r>
+              <w:t>#9</w:t>
+            </w:r>
+          </w:p>
+        </w:tc>
+        <w:tc>
+          <w:tcPr>
+            <w:tcW w:type="dxa" w:w="2160"/>
+          </w:tcPr>
+          <w:p>
+            <w:r>
+              <w:t>Organizar el repositorio y el README</w:t>
+            </w:r>
+          </w:p>
+        </w:tc>
+        <w:tc>
+          <w:tcPr>
+            <w:tcW w:type="dxa" w:w="2160"/>
+          </w:tcPr>
+          <w:p>
+            <w:r>
+              <w:t>tarea</w:t>
+            </w:r>
+          </w:p>
+        </w:tc>
+        <w:tc>
+          <w:tcPr>
+            <w:tcW w:type="dxa" w:w="2160"/>
+          </w:tcPr>
+          <w:p>
+            <w:r>
+              <w:t>Cerrado</w:t>
+            </w:r>
+          </w:p>
+        </w:tc>
+      </w:tr>
+      <w:tr>
+        <w:tc>
+          <w:tcPr>
+            <w:tcW w:type="dxa" w:w="2160"/>
+          </w:tcPr>
+          <w:p>
+            <w:r>
+              <w:t>#10</w:t>
+            </w:r>
+          </w:p>
+        </w:tc>
+        <w:tc>
+          <w:tcPr>
+            <w:tcW w:type="dxa" w:w="2160"/>
+          </w:tcPr>
+          <w:p>
+            <w:r>
+              <w:t>Preparar el informe final en PDF</w:t>
+            </w:r>
+          </w:p>
+        </w:tc>
+        <w:tc>
+          <w:tcPr>
+            <w:tcW w:type="dxa" w:w="2160"/>
+          </w:tcPr>
+          <w:p>
+            <w:r>
+              <w:t>tarea</w:t>
+            </w:r>
+          </w:p>
+        </w:tc>
+        <w:tc>
+          <w:tcPr>
+            <w:tcW w:type="dxa" w:w="2160"/>
+          </w:tcPr>
+          <w:p>
+            <w:r>
+              <w:t>Cerrado</w:t>
+            </w:r>
+          </w:p>
+        </w:tc>
+      </w:tr>
+      <w:tr>
+        <w:tc>
+          <w:tcPr>
+            <w:tcW w:type="dxa" w:w="2160"/>
+          </w:tcPr>
+          <w:p>
+            <w:r>
+              <w:t>#11</w:t>
+            </w:r>
+          </w:p>
+        </w:tc>
+        <w:tc>
+          <w:tcPr>
+            <w:tcW w:type="dxa" w:w="2160"/>
+          </w:tcPr>
+          <w:p>
+            <w:r>
+              <w:t>Invitar al docente al repositorio</w:t>
+            </w:r>
+          </w:p>
+        </w:tc>
+        <w:tc>
+          <w:tcPr>
+            <w:tcW w:type="dxa" w:w="2160"/>
+          </w:tcPr>
+          <w:p>
+            <w:r>
+              <w:t>tarea</w:t>
+            </w:r>
+          </w:p>
+        </w:tc>
+        <w:tc>
+          <w:tcPr>
+            <w:tcW w:type="dxa" w:w="2160"/>
+          </w:tcPr>
+          <w:p>
+            <w:r>
+              <w:t>Cerrado</w:t>
+            </w:r>
+          </w:p>
+        </w:tc>
+      </w:tr>
+    </w:tbl>
+    <w:p>
+      <w:r>
+        <w:t>Flujo de trabajo Git: trabajo realizado en la rama main con commits descriptivos (docs:, test:, evidencias:, chore:) y subido con git push. El listado completo de commits esta disponible en https://github.com/mew145/Examen-Hito-3-TQA/commits/main</w:t>
+      </w:r>
+    </w:p>
+    <w:p>
+      <w:pPr>
+        <w:pStyle w:val="Heading1"/>
+      </w:pPr>
+      <w:r>
+        <w:t>7. Conclusiones</w:t>
       </w:r>
     </w:p>
     <w:p>
@@ -6233,7 +6963,15 @@
         <w:pStyle w:val="ListBullet"/>
       </w:pPr>
       <w:r>
-        <w:t>El trabajo esta versionado en Git/GitHub con commits descriptivos, Issues y Project Board para el seguimiento de las tareas.</w:t>
+        <w:t>Se encontro y documento un defecto reproducible (BUG-001) de validacion de datos en el checkout, el cual no compromete la compra pero si la calidad de la validacion de entradas.</w:t>
+      </w:r>
+    </w:p>
+    <w:p>
+      <w:pPr>
+        <w:pStyle w:val="ListBullet"/>
+      </w:pPr>
+      <w:r>
+        <w:t>El trabajo esta versionado en Git/GitHub con commits descriptivos e Issues de seguimiento en https://github.com/mew145/Examen-Hito-3-TQA</w:t>
       </w:r>
     </w:p>
     <w:sectPr>

</xml_diff>